<commit_message>
Fix page breaks, risk assessment to landscape, complaints contact layout
- Section headings and teal rule now carry keep-with-next so headings
  never orphan from their content
- add_teal_rule replaced with paragraph bottom-border (was a table,
  which cannot carry keep-with-next through to following content)
- Complaints escalation contacts replaced with info table (was
  incorrectly using form_table, which renders blank fill-in rows)
- Risk assessment rebuilt as A4 landscape with expanded column widths
  (controls col 10.5 cm, additional action 5.6 cm)
- COSHH substances table added to risk assessment with full row detail
- Review log extended to 4 columns (trigger column added)

Co-Authored-By: Claude Sonnet 4.6 <noreply@anthropic.com>
</commit_message>
<xml_diff>
--- a/compliance/templates/Complaints_Procedure.docx
+++ b/compliance/templates/Complaints_Procedure.docx
@@ -77,7 +77,8 @@
     </w:p>
     <w:p>
       <w:pPr>
-        <w:spacing w:before="160" w:after="80"/>
+        <w:keepNext/>
+        <w:spacing w:before="200" w:after="0"/>
       </w:pPr>
       <w:r>
         <w:rPr>
@@ -89,34 +90,15 @@
         <w:t>How to raise a concern</w:t>
       </w:r>
     </w:p>
-    <w:tbl>
-      <w:tblPr>
-        <w:tblW w:type="auto" w:w="0"/>
-        <w:tblLook w:firstColumn="1" w:firstRow="1" w:lastColumn="0" w:lastRow="0" w:noHBand="0" w:noVBand="1" w:val="04A0"/>
-      </w:tblPr>
-      <w:tblGrid>
-        <w:gridCol w:w="9638"/>
-      </w:tblGrid>
-      <w:tr>
-        <w:trPr>
-          <w:trHeight w:val="80" w:hRule="exact"/>
-        </w:trPr>
-        <w:tc>
-          <w:tcPr>
-            <w:tcW w:type="dxa" w:w="9638"/>
-            <w:shd w:val="clear" w:color="auto" w:fill="2E7D83"/>
-            <w:tcBorders>
-              <w:top w:val="none"/>
-              <w:bottom w:val="none"/>
-              <w:left w:val="none"/>
-              <w:right w:val="none"/>
-            </w:tcBorders>
-          </w:tcPr>
-          <w:p/>
-        </w:tc>
-      </w:tr>
-    </w:tbl>
-    <w:p/>
+    <w:p>
+      <w:pPr>
+        <w:keepNext/>
+        <w:spacing w:before="0" w:after="120"/>
+        <w:pBdr>
+          <w:bottom w:val="single" w:sz="12" w:space="1" w:color="2E7D83"/>
+        </w:pBdr>
+      </w:pPr>
+    </w:p>
     <w:p>
       <w:pPr>
         <w:spacing w:before="0" w:after="80"/>
@@ -177,19 +159,19 @@
       <w:tblPr>
         <w:tblStyle w:val="TableGrid"/>
         <w:tblW w:type="auto" w:w="0"/>
-        <w:jc w:val="left"/>
         <w:tblLook w:firstColumn="1" w:firstRow="1" w:lastColumn="0" w:lastRow="0" w:noHBand="0" w:noVBand="1" w:val="04A0"/>
       </w:tblPr>
       <w:tblGrid>
-        <w:gridCol w:w="1984"/>
-        <w:gridCol w:w="2693"/>
-        <w:gridCol w:w="1984"/>
-        <w:gridCol w:w="2693"/>
+        <w:gridCol w:w="3118"/>
+        <w:gridCol w:w="6236"/>
       </w:tblGrid>
       <w:tr>
+        <w:trPr>
+          <w:trHeight w:val="360" w:hRule="atLeast"/>
+        </w:trPr>
         <w:tc>
           <w:tcPr>
-            <w:tcW w:type="dxa" w:w="1984"/>
+            <w:tcW w:type="dxa" w:w="4819"/>
             <w:shd w:val="clear" w:color="auto" w:fill="F0F7F7"/>
             <w:tcBorders>
               <w:top w:val="single" w:sz="4" w:color="D4E3E4"/>
@@ -198,10 +180,10 @@
               <w:right w:val="single" w:sz="4" w:color="D4E3E4"/>
             </w:tcBorders>
             <w:tcMar>
-              <w:top w:w="80" w:type="dxa"/>
-              <w:bottom w:w="80" w:type="dxa"/>
-              <w:left w:w="108" w:type="dxa"/>
-              <w:right w:w="108" w:type="dxa"/>
+              <w:top w:w="100" w:type="dxa"/>
+              <w:bottom w:w="100" w:type="dxa"/>
+              <w:left w:w="120" w:type="dxa"/>
+              <w:right w:w="120" w:type="dxa"/>
             </w:tcMar>
           </w:tcPr>
           <w:p>
@@ -212,22 +194,13 @@
                 <w:color w:val="1F5A5F"/>
                 <w:sz w:val="18"/>
               </w:rPr>
-              <w:t>HCPC — fitness to practise concerns:</w:t>
-            </w:r>
-            <w:r>
-              <w:rPr>
-                <w:i/>
-                <w:color w:val="4A4A4A"/>
-                <w:sz w:val="16"/>
-              </w:rPr>
-              <w:br/>
-              <w:t>fitness@hcpc-uk.org  |  0300 500 4472  |  hcpc-uk.org</w:t>
+              <w:t>HCPC — fitness to practise concerns</w:t>
             </w:r>
           </w:p>
         </w:tc>
         <w:tc>
           <w:tcPr>
-            <w:tcW w:type="dxa" w:w="2693"/>
+            <w:tcW w:type="dxa" w:w="4819"/>
             <w:shd w:val="clear" w:color="auto" w:fill="FFFFFF"/>
             <w:tcBorders>
               <w:top w:val="single" w:sz="4" w:color="D4E3E4"/>
@@ -236,19 +209,31 @@
               <w:right w:val="single" w:sz="4" w:color="D4E3E4"/>
             </w:tcBorders>
             <w:tcMar>
-              <w:top w:w="80" w:type="dxa"/>
-              <w:bottom w:w="80" w:type="dxa"/>
-              <w:left w:w="108" w:type="dxa"/>
-              <w:right w:w="108" w:type="dxa"/>
+              <w:top w:w="100" w:type="dxa"/>
+              <w:bottom w:w="100" w:type="dxa"/>
+              <w:left w:w="120" w:type="dxa"/>
+              <w:right w:w="120" w:type="dxa"/>
             </w:tcMar>
           </w:tcPr>
           <w:p>
-            <w:r/>
+            <w:r>
+              <w:rPr>
+                <w:rFonts w:ascii="Calibri" w:hAnsi="Calibri"/>
+                <w:color w:val="1F1F1F"/>
+                <w:sz w:val="18"/>
+              </w:rPr>
+              <w:t>fitness@hcpc-uk.org  |  0300 500 4472  |  hcpc-uk.org</w:t>
+            </w:r>
           </w:p>
         </w:tc>
+      </w:tr>
+      <w:tr>
+        <w:trPr>
+          <w:trHeight w:val="360" w:hRule="atLeast"/>
+        </w:trPr>
         <w:tc>
           <w:tcPr>
-            <w:tcW w:type="dxa" w:w="1984"/>
+            <w:tcW w:type="dxa" w:w="4819"/>
             <w:shd w:val="clear" w:color="auto" w:fill="F0F7F7"/>
             <w:tcBorders>
               <w:top w:val="single" w:sz="4" w:color="D4E3E4"/>
@@ -257,10 +242,10 @@
               <w:right w:val="single" w:sz="4" w:color="D4E3E4"/>
             </w:tcBorders>
             <w:tcMar>
-              <w:top w:w="80" w:type="dxa"/>
-              <w:bottom w:w="80" w:type="dxa"/>
-              <w:left w:w="108" w:type="dxa"/>
-              <w:right w:w="108" w:type="dxa"/>
+              <w:top w:w="100" w:type="dxa"/>
+              <w:bottom w:w="100" w:type="dxa"/>
+              <w:left w:w="120" w:type="dxa"/>
+              <w:right w:w="120" w:type="dxa"/>
             </w:tcMar>
           </w:tcPr>
           <w:p>
@@ -271,22 +256,13 @@
                 <w:color w:val="1F5A5F"/>
                 <w:sz w:val="18"/>
               </w:rPr>
-              <w:t>ICO — data protection concerns:</w:t>
-            </w:r>
-            <w:r>
-              <w:rPr>
-                <w:i/>
-                <w:color w:val="4A4A4A"/>
-                <w:sz w:val="16"/>
-              </w:rPr>
-              <w:br/>
-              <w:t>casework@ico.org.uk  |  0303 123 1113  |  ico.org.uk</w:t>
+              <w:t>ICO — data protection concerns</w:t>
             </w:r>
           </w:p>
         </w:tc>
         <w:tc>
           <w:tcPr>
-            <w:tcW w:type="dxa" w:w="2693"/>
+            <w:tcW w:type="dxa" w:w="4819"/>
             <w:shd w:val="clear" w:color="auto" w:fill="FFFFFF"/>
             <w:tcBorders>
               <w:top w:val="single" w:sz="4" w:color="D4E3E4"/>
@@ -295,14 +271,21 @@
               <w:right w:val="single" w:sz="4" w:color="D4E3E4"/>
             </w:tcBorders>
             <w:tcMar>
-              <w:top w:w="80" w:type="dxa"/>
-              <w:bottom w:w="80" w:type="dxa"/>
-              <w:left w:w="108" w:type="dxa"/>
-              <w:right w:w="108" w:type="dxa"/>
+              <w:top w:w="100" w:type="dxa"/>
+              <w:bottom w:w="100" w:type="dxa"/>
+              <w:left w:w="120" w:type="dxa"/>
+              <w:right w:w="120" w:type="dxa"/>
             </w:tcMar>
           </w:tcPr>
           <w:p>
-            <w:r/>
+            <w:r>
+              <w:rPr>
+                <w:rFonts w:ascii="Calibri" w:hAnsi="Calibri"/>
+                <w:color w:val="1F1F1F"/>
+                <w:sz w:val="18"/>
+              </w:rPr>
+              <w:t>casework@ico.org.uk  |  0303 123 1113  |  ico.org.uk</w:t>
+            </w:r>
           </w:p>
         </w:tc>
       </w:tr>
@@ -310,7 +293,8 @@
     <w:p/>
     <w:p>
       <w:pPr>
-        <w:spacing w:before="160" w:after="80"/>
+        <w:keepNext/>
+        <w:spacing w:before="200" w:after="0"/>
       </w:pPr>
       <w:r>
         <w:rPr>
@@ -322,34 +306,15 @@
         <w:t>Our commitment</w:t>
       </w:r>
     </w:p>
-    <w:tbl>
-      <w:tblPr>
-        <w:tblW w:type="auto" w:w="0"/>
-        <w:tblLook w:firstColumn="1" w:firstRow="1" w:lastColumn="0" w:lastRow="0" w:noHBand="0" w:noVBand="1" w:val="04A0"/>
-      </w:tblPr>
-      <w:tblGrid>
-        <w:gridCol w:w="9638"/>
-      </w:tblGrid>
-      <w:tr>
-        <w:trPr>
-          <w:trHeight w:val="80" w:hRule="exact"/>
-        </w:trPr>
-        <w:tc>
-          <w:tcPr>
-            <w:tcW w:type="dxa" w:w="9638"/>
-            <w:shd w:val="clear" w:color="auto" w:fill="2E7D83"/>
-            <w:tcBorders>
-              <w:top w:val="none"/>
-              <w:bottom w:val="none"/>
-              <w:left w:val="none"/>
-              <w:right w:val="none"/>
-            </w:tcBorders>
-          </w:tcPr>
-          <w:p/>
-        </w:tc>
-      </w:tr>
-    </w:tbl>
-    <w:p/>
+    <w:p>
+      <w:pPr>
+        <w:keepNext/>
+        <w:spacing w:before="0" w:after="120"/>
+        <w:pBdr>
+          <w:bottom w:val="single" w:sz="12" w:space="1" w:color="2E7D83"/>
+        </w:pBdr>
+      </w:pPr>
+    </w:p>
     <w:p>
       <w:pPr>
         <w:spacing w:before="40" w:after="40"/>
@@ -436,7 +401,8 @@
     </w:p>
     <w:p>
       <w:pPr>
-        <w:spacing w:before="160" w:after="80"/>
+        <w:keepNext/>
+        <w:spacing w:before="200" w:after="0"/>
       </w:pPr>
       <w:r>
         <w:rPr>
@@ -448,34 +414,15 @@
         <w:t>Complaint log — for practitioner use</w:t>
       </w:r>
     </w:p>
-    <w:tbl>
-      <w:tblPr>
-        <w:tblW w:type="auto" w:w="0"/>
-        <w:tblLook w:firstColumn="1" w:firstRow="1" w:lastColumn="0" w:lastRow="0" w:noHBand="0" w:noVBand="1" w:val="04A0"/>
-      </w:tblPr>
-      <w:tblGrid>
-        <w:gridCol w:w="9638"/>
-      </w:tblGrid>
-      <w:tr>
-        <w:trPr>
-          <w:trHeight w:val="80" w:hRule="exact"/>
-        </w:trPr>
-        <w:tc>
-          <w:tcPr>
-            <w:tcW w:type="dxa" w:w="9638"/>
-            <w:shd w:val="clear" w:color="auto" w:fill="2E7D83"/>
-            <w:tcBorders>
-              <w:top w:val="none"/>
-              <w:bottom w:val="none"/>
-              <w:left w:val="none"/>
-              <w:right w:val="none"/>
-            </w:tcBorders>
-          </w:tcPr>
-          <w:p/>
-        </w:tc>
-      </w:tr>
-    </w:tbl>
-    <w:p/>
+    <w:p>
+      <w:pPr>
+        <w:keepNext/>
+        <w:spacing w:before="0" w:after="120"/>
+        <w:pBdr>
+          <w:bottom w:val="single" w:sz="12" w:space="1" w:color="2E7D83"/>
+        </w:pBdr>
+      </w:pPr>
+    </w:p>
     <w:tbl>
       <w:tblPr>
         <w:tblStyle w:val="TableGrid"/>

</xml_diff>